<commit_message>
update report and repository link
</commit_message>
<xml_diff>
--- a/report/Mapping Musical Genres as a Similarity Network Using Spotify Audio Features.docx
+++ b/report/Mapping Musical Genres as a Similarity Network Using Spotify Audio Features.docx
@@ -2984,7 +2984,7 @@
           <w:lang w:val="tr-TR"/>
         </w:rPr>
         <w:drawing>
-          <wp:inline distT="0" distB="0" distL="0" distR="0" wp14:anchorId="4445AC4E" wp14:editId="0CD0EA4C">
+          <wp:inline distT="0" distB="0" distL="0" distR="0" wp14:anchorId="4445AC4E" wp14:editId="50229372">
             <wp:extent cx="5943600" cy="1331595"/>
             <wp:effectExtent l="0" t="0" r="0" b="1905"/>
             <wp:docPr id="1661495872" name="Picture 6" descr="A screenshot of a graph&#10;&#10;AI-generated content may be incorrect."/>
@@ -3880,7 +3880,7 @@
           <w:rFonts w:ascii="Times New Roman" w:hAnsi="Times New Roman" w:cs="Times New Roman"/>
           <w:lang w:val="tr-TR"/>
         </w:rPr>
-        <w:t>https://github.com/EfeTarimmm</w:t>
+        <w:t>https://github.com/EfeTarimmm/cs414-music-genre-network</w:t>
       </w:r>
     </w:p>
     <w:p>

</xml_diff>